<commit_message>
Remove cloud and account branches
</commit_message>
<xml_diff>
--- a/docs/research-report/Skarly_Research_Internship_Report.docx
+++ b/docs/research-report/Skarly_Research_Internship_Report.docx
@@ -783,14 +783,14 @@
           <w:b/>
           <w:color w:val="17202A"/>
         </w:rPr>
-        <w:t xml:space="preserve">Private upload. </w:t>
+        <w:t xml:space="preserve">Local upload. </w:t>
       </w:r>
       <w:r>
         <w:rPr>
           <w:rFonts w:ascii="Calibri" w:hAnsi="Calibri"/>
           <w:color w:val="17202A"/>
         </w:rPr>
-        <w:t>The client obtains an account- or guest-scoped upload path, transfers the audio, and verifies that it exists before analysis.</w:t>
+        <w:t>The guest client transfers the selected audio to local storage and verifies that it exists before analysis.</w:t>
       </w:r>
     </w:p>
     <w:p>
@@ -2012,7 +2012,7 @@
           <w:color w:val="5B6570"/>
           <w:sz w:val="18"/>
         </w:rPr>
-        <w:t>Figure 3. Real training and grouped-validation curves exported from skarly_audio_cnn.pt.</w:t>
+        <w:t>Figure 3. Real training and grouped-validation curves from the retained training-history export.</w:t>
       </w:r>
     </w:p>
     <w:p>
@@ -2355,7 +2355,7 @@
               <a:graphicData uri="http://schemas.openxmlformats.org/drawingml/2006/picture">
                 <pic:pic>
                   <pic:nvPicPr>
-                    <pic:cNvPr id="0" name="00-account-choice.png"/>
+                    <pic:cNvPr id="0" name="02-creator-setup.png"/>
                     <pic:cNvPicPr/>
                   </pic:nvPicPr>
                   <pic:blipFill>
@@ -2392,7 +2392,7 @@
           <w:color w:val="5B6570"/>
           <w:sz w:val="18"/>
         </w:rPr>
-        <w:t>Figure 8. Account choice with guest entry and saved-account options.</w:t>
+        <w:t>Figure 8. Local creator setup.</w:t>
       </w:r>
     </w:p>
     <w:p>
@@ -2413,7 +2413,7 @@
               <a:graphicData uri="http://schemas.openxmlformats.org/drawingml/2006/picture">
                 <pic:pic>
                   <pic:nvPicPr>
-                    <pic:cNvPr id="0" name="05-upload-selected.png"/>
+                    <pic:cNvPr id="0" name="04-upload-empty.png"/>
                     <pic:cNvPicPr/>
                   </pic:nvPicPr>
                   <pic:blipFill>
@@ -2450,7 +2450,7 @@
           <w:color w:val="5B6570"/>
           <w:sz w:val="18"/>
         </w:rPr>
-        <w:t>Figure 9. Supplied audio selected and verified for the guest workflow.</w:t>
+        <w:t>Figure 9. Local audio input and mode selection.</w:t>
       </w:r>
     </w:p>
     <w:p>
@@ -3433,7 +3433,7 @@
           <w:color w:val="17202A"/>
           <w:sz w:val="21"/>
         </w:rPr>
-        <w:t>Model weights, GPU drivers, FFmpeg, Firebase credentials, and cloud resources are environment-specific. The offline example files document the minimum variables without committing secrets.</w:t>
+        <w:t>ACE-Step weights, GPU drivers, FFmpeg, and local tool paths are environment-specific. The offline example files document the minimum variables without committing secrets.</w:t>
       </w:r>
     </w:p>
     <w:p>
@@ -3495,7 +3495,7 @@
               <a:graphicData uri="http://schemas.openxmlformats.org/drawingml/2006/picture">
                 <pic:pic>
                   <pic:nvPicPr>
-                    <pic:cNvPr id="0" name="00-account-choice.png"/>
+                    <pic:cNvPr id="0" name="02-creator-setup.png"/>
                     <pic:cNvPicPr/>
                   </pic:nvPicPr>
                   <pic:blipFill>
@@ -3532,7 +3532,7 @@
           <w:color w:val="5B6570"/>
           <w:sz w:val="18"/>
         </w:rPr>
-        <w:t>UI-01. 00 Account Choice.</w:t>
+        <w:t>UI-01. 02 Creator Setup.</w:t>
       </w:r>
     </w:p>
     <w:p>
@@ -3553,7 +3553,7 @@
               <a:graphicData uri="http://schemas.openxmlformats.org/drawingml/2006/picture">
                 <pic:pic>
                   <pic:nvPicPr>
-                    <pic:cNvPr id="0" name="01-guest-entry.png"/>
+                    <pic:cNvPr id="0" name="03-home.png"/>
                     <pic:cNvPicPr/>
                   </pic:nvPicPr>
                   <pic:blipFill>
@@ -3590,7 +3590,7 @@
           <w:color w:val="5B6570"/>
           <w:sz w:val="18"/>
         </w:rPr>
-        <w:t>UI-02. 01 Guest Entry.</w:t>
+        <w:t>UI-02. 03 Home.</w:t>
       </w:r>
     </w:p>
     <w:p>
@@ -3616,7 +3616,65 @@
               <a:graphicData uri="http://schemas.openxmlformats.org/drawingml/2006/picture">
                 <pic:pic>
                   <pic:nvPicPr>
-                    <pic:cNvPr id="0" name="02-creator-setup.png"/>
+                    <pic:cNvPr id="0" name="04-upload-empty.png"/>
+                    <pic:cNvPicPr/>
+                  </pic:nvPicPr>
+                  <pic:blipFill>
+                    <a:blip r:embed="rId20"/>
+                    <a:stretch>
+                      <a:fillRect/>
+                    </a:stretch>
+                  </pic:blipFill>
+                  <pic:spPr>
+                    <a:xfrm>
+                      <a:off x="0" y="0"/>
+                      <a:ext cx="5303520" cy="2983230"/>
+                    </a:xfrm>
+                    <a:prstGeom prst="rect"/>
+                  </pic:spPr>
+                </pic:pic>
+              </a:graphicData>
+            </a:graphic>
+          </wp:inline>
+        </w:drawing>
+      </w:r>
+    </w:p>
+    <w:p>
+      <w:pPr>
+        <w:pStyle w:val="Caption"/>
+        <w:keepNext w:val="0"/>
+        <w:spacing w:before="80" w:after="160"/>
+        <w:jc w:val="center"/>
+      </w:pPr>
+      <w:r>
+        <w:rPr>
+          <w:rFonts w:ascii="Calibri" w:hAnsi="Calibri"/>
+          <w:i/>
+          <w:color w:val="5B6570"/>
+          <w:sz w:val="18"/>
+        </w:rPr>
+        <w:t>UI-03. 04 Upload Empty.</w:t>
+      </w:r>
+    </w:p>
+    <w:p>
+      <w:pPr>
+        <w:keepNext/>
+        <w:spacing w:before="120" w:after="0"/>
+        <w:jc w:val="center"/>
+      </w:pPr>
+      <w:r>
+        <w:drawing>
+          <wp:inline xmlns:a="http://schemas.openxmlformats.org/drawingml/2006/main" xmlns:pic="http://schemas.openxmlformats.org/drawingml/2006/picture">
+            <wp:extent cx="5303520" cy="2983230"/>
+            <wp:docPr id="17" name="Picture 17"/>
+            <wp:cNvGraphicFramePr>
+              <a:graphicFrameLocks noChangeAspect="1"/>
+            </wp:cNvGraphicFramePr>
+            <a:graphic>
+              <a:graphicData uri="http://schemas.openxmlformats.org/drawingml/2006/picture">
+                <pic:pic>
+                  <pic:nvPicPr>
+                    <pic:cNvPr id="0" name="06-audio-analyzing.png"/>
                     <pic:cNvPicPr/>
                   </pic:nvPicPr>
                   <pic:blipFill>
@@ -3653,65 +3711,7 @@
           <w:color w:val="5B6570"/>
           <w:sz w:val="18"/>
         </w:rPr>
-        <w:t>UI-03. 02 Creator Setup.</w:t>
-      </w:r>
-    </w:p>
-    <w:p>
-      <w:pPr>
-        <w:keepNext/>
-        <w:spacing w:before="120" w:after="0"/>
-        <w:jc w:val="center"/>
-      </w:pPr>
-      <w:r>
-        <w:drawing>
-          <wp:inline xmlns:a="http://schemas.openxmlformats.org/drawingml/2006/main" xmlns:pic="http://schemas.openxmlformats.org/drawingml/2006/picture">
-            <wp:extent cx="5303520" cy="2983230"/>
-            <wp:docPr id="17" name="Picture 17"/>
-            <wp:cNvGraphicFramePr>
-              <a:graphicFrameLocks noChangeAspect="1"/>
-            </wp:cNvGraphicFramePr>
-            <a:graphic>
-              <a:graphicData uri="http://schemas.openxmlformats.org/drawingml/2006/picture">
-                <pic:pic>
-                  <pic:nvPicPr>
-                    <pic:cNvPr id="0" name="03-home.png"/>
-                    <pic:cNvPicPr/>
-                  </pic:nvPicPr>
-                  <pic:blipFill>
-                    <a:blip r:embed="rId26"/>
-                    <a:stretch>
-                      <a:fillRect/>
-                    </a:stretch>
-                  </pic:blipFill>
-                  <pic:spPr>
-                    <a:xfrm>
-                      <a:off x="0" y="0"/>
-                      <a:ext cx="5303520" cy="2983230"/>
-                    </a:xfrm>
-                    <a:prstGeom prst="rect"/>
-                  </pic:spPr>
-                </pic:pic>
-              </a:graphicData>
-            </a:graphic>
-          </wp:inline>
-        </w:drawing>
-      </w:r>
-    </w:p>
-    <w:p>
-      <w:pPr>
-        <w:pStyle w:val="Caption"/>
-        <w:keepNext w:val="0"/>
-        <w:spacing w:before="80" w:after="160"/>
-        <w:jc w:val="center"/>
-      </w:pPr>
-      <w:r>
-        <w:rPr>
-          <w:rFonts w:ascii="Calibri" w:hAnsi="Calibri"/>
-          <w:i/>
-          <w:color w:val="5B6570"/>
-          <w:sz w:val="18"/>
-        </w:rPr>
-        <w:t>UI-04. 03 Home.</w:t>
+        <w:t>UI-04. 06 Audio Analyzing.</w:t>
       </w:r>
     </w:p>
     <w:p>
@@ -3730,185 +3730,6 @@
           <wp:inline xmlns:a="http://schemas.openxmlformats.org/drawingml/2006/main" xmlns:pic="http://schemas.openxmlformats.org/drawingml/2006/picture">
             <wp:extent cx="5303520" cy="2983230"/>
             <wp:docPr id="18" name="Picture 18"/>
-            <wp:cNvGraphicFramePr>
-              <a:graphicFrameLocks noChangeAspect="1"/>
-            </wp:cNvGraphicFramePr>
-            <a:graphic>
-              <a:graphicData uri="http://schemas.openxmlformats.org/drawingml/2006/picture">
-                <pic:pic>
-                  <pic:nvPicPr>
-                    <pic:cNvPr id="0" name="04-upload-empty.png"/>
-                    <pic:cNvPicPr/>
-                  </pic:nvPicPr>
-                  <pic:blipFill>
-                    <a:blip r:embed="rId27"/>
-                    <a:stretch>
-                      <a:fillRect/>
-                    </a:stretch>
-                  </pic:blipFill>
-                  <pic:spPr>
-                    <a:xfrm>
-                      <a:off x="0" y="0"/>
-                      <a:ext cx="5303520" cy="2983230"/>
-                    </a:xfrm>
-                    <a:prstGeom prst="rect"/>
-                  </pic:spPr>
-                </pic:pic>
-              </a:graphicData>
-            </a:graphic>
-          </wp:inline>
-        </w:drawing>
-      </w:r>
-    </w:p>
-    <w:p>
-      <w:pPr>
-        <w:pStyle w:val="Caption"/>
-        <w:keepNext w:val="0"/>
-        <w:spacing w:before="80" w:after="160"/>
-        <w:jc w:val="center"/>
-      </w:pPr>
-      <w:r>
-        <w:rPr>
-          <w:rFonts w:ascii="Calibri" w:hAnsi="Calibri"/>
-          <w:i/>
-          <w:color w:val="5B6570"/>
-          <w:sz w:val="18"/>
-        </w:rPr>
-        <w:t>UI-05. 04 Upload Empty.</w:t>
-      </w:r>
-    </w:p>
-    <w:p>
-      <w:pPr>
-        <w:keepNext/>
-        <w:spacing w:before="120" w:after="0"/>
-        <w:jc w:val="center"/>
-      </w:pPr>
-      <w:r>
-        <w:drawing>
-          <wp:inline xmlns:a="http://schemas.openxmlformats.org/drawingml/2006/main" xmlns:pic="http://schemas.openxmlformats.org/drawingml/2006/picture">
-            <wp:extent cx="5303520" cy="2983230"/>
-            <wp:docPr id="19" name="Picture 19"/>
-            <wp:cNvGraphicFramePr>
-              <a:graphicFrameLocks noChangeAspect="1"/>
-            </wp:cNvGraphicFramePr>
-            <a:graphic>
-              <a:graphicData uri="http://schemas.openxmlformats.org/drawingml/2006/picture">
-                <pic:pic>
-                  <pic:nvPicPr>
-                    <pic:cNvPr id="0" name="05-upload-selected.png"/>
-                    <pic:cNvPicPr/>
-                  </pic:nvPicPr>
-                  <pic:blipFill>
-                    <a:blip r:embed="rId20"/>
-                    <a:stretch>
-                      <a:fillRect/>
-                    </a:stretch>
-                  </pic:blipFill>
-                  <pic:spPr>
-                    <a:xfrm>
-                      <a:off x="0" y="0"/>
-                      <a:ext cx="5303520" cy="2983230"/>
-                    </a:xfrm>
-                    <a:prstGeom prst="rect"/>
-                  </pic:spPr>
-                </pic:pic>
-              </a:graphicData>
-            </a:graphic>
-          </wp:inline>
-        </w:drawing>
-      </w:r>
-    </w:p>
-    <w:p>
-      <w:pPr>
-        <w:pStyle w:val="Caption"/>
-        <w:keepNext w:val="0"/>
-        <w:spacing w:before="80" w:after="160"/>
-        <w:jc w:val="center"/>
-      </w:pPr>
-      <w:r>
-        <w:rPr>
-          <w:rFonts w:ascii="Calibri" w:hAnsi="Calibri"/>
-          <w:i/>
-          <w:color w:val="5B6570"/>
-          <w:sz w:val="18"/>
-        </w:rPr>
-        <w:t>UI-06. 05 Upload Selected.</w:t>
-      </w:r>
-    </w:p>
-    <w:p>
-      <w:r>
-        <w:br w:type="page"/>
-      </w:r>
-    </w:p>
-    <w:p>
-      <w:pPr>
-        <w:keepNext/>
-        <w:spacing w:before="120" w:after="0"/>
-        <w:jc w:val="center"/>
-      </w:pPr>
-      <w:r>
-        <w:drawing>
-          <wp:inline xmlns:a="http://schemas.openxmlformats.org/drawingml/2006/main" xmlns:pic="http://schemas.openxmlformats.org/drawingml/2006/picture">
-            <wp:extent cx="5303520" cy="2983230"/>
-            <wp:docPr id="20" name="Picture 20"/>
-            <wp:cNvGraphicFramePr>
-              <a:graphicFrameLocks noChangeAspect="1"/>
-            </wp:cNvGraphicFramePr>
-            <a:graphic>
-              <a:graphicData uri="http://schemas.openxmlformats.org/drawingml/2006/picture">
-                <pic:pic>
-                  <pic:nvPicPr>
-                    <pic:cNvPr id="0" name="06-audio-analyzing.png"/>
-                    <pic:cNvPicPr/>
-                  </pic:nvPicPr>
-                  <pic:blipFill>
-                    <a:blip r:embed="rId28"/>
-                    <a:stretch>
-                      <a:fillRect/>
-                    </a:stretch>
-                  </pic:blipFill>
-                  <pic:spPr>
-                    <a:xfrm>
-                      <a:off x="0" y="0"/>
-                      <a:ext cx="5303520" cy="2983230"/>
-                    </a:xfrm>
-                    <a:prstGeom prst="rect"/>
-                  </pic:spPr>
-                </pic:pic>
-              </a:graphicData>
-            </a:graphic>
-          </wp:inline>
-        </w:drawing>
-      </w:r>
-    </w:p>
-    <w:p>
-      <w:pPr>
-        <w:pStyle w:val="Caption"/>
-        <w:keepNext w:val="0"/>
-        <w:spacing w:before="80" w:after="160"/>
-        <w:jc w:val="center"/>
-      </w:pPr>
-      <w:r>
-        <w:rPr>
-          <w:rFonts w:ascii="Calibri" w:hAnsi="Calibri"/>
-          <w:i/>
-          <w:color w:val="5B6570"/>
-          <w:sz w:val="18"/>
-        </w:rPr>
-        <w:t>UI-07. 06 Audio Analyzing.</w:t>
-      </w:r>
-    </w:p>
-    <w:p>
-      <w:pPr>
-        <w:keepNext/>
-        <w:spacing w:before="120" w:after="0"/>
-        <w:jc w:val="center"/>
-      </w:pPr>
-      <w:r>
-        <w:drawing>
-          <wp:inline xmlns:a="http://schemas.openxmlformats.org/drawingml/2006/main" xmlns:pic="http://schemas.openxmlformats.org/drawingml/2006/picture">
-            <wp:extent cx="5303520" cy="2983230"/>
-            <wp:docPr id="21" name="Picture 21"/>
             <wp:cNvGraphicFramePr>
               <a:graphicFrameLocks noChangeAspect="1"/>
             </wp:cNvGraphicFramePr>
@@ -3953,12 +3774,7 @@
           <w:color w:val="5B6570"/>
           <w:sz w:val="18"/>
         </w:rPr>
-        <w:t>UI-08. 06 Audio Detected.</w:t>
-      </w:r>
-    </w:p>
-    <w:p>
-      <w:r>
-        <w:br w:type="page"/>
+        <w:t>UI-05. 06 Audio Detected.</w:t>
       </w:r>
     </w:p>
     <w:p>
@@ -3971,7 +3787,7 @@
         <w:drawing>
           <wp:inline xmlns:a="http://schemas.openxmlformats.org/drawingml/2006/main" xmlns:pic="http://schemas.openxmlformats.org/drawingml/2006/picture">
             <wp:extent cx="5303520" cy="2983230"/>
-            <wp:docPr id="22" name="Picture 22"/>
+            <wp:docPr id="19" name="Picture 19"/>
             <wp:cNvGraphicFramePr>
               <a:graphicFrameLocks noChangeAspect="1"/>
             </wp:cNvGraphicFramePr>
@@ -3983,7 +3799,7 @@
                     <pic:cNvPicPr/>
                   </pic:nvPicPr>
                   <pic:blipFill>
-                    <a:blip r:embed="rId29"/>
+                    <a:blip r:embed="rId26"/>
                     <a:stretch>
                       <a:fillRect/>
                     </a:stretch>
@@ -4016,7 +3832,12 @@
           <w:color w:val="5B6570"/>
           <w:sz w:val="18"/>
         </w:rPr>
-        <w:t>UI-09. 07 Producer Selection.</w:t>
+        <w:t>UI-06. 07 Producer Selection.</w:t>
+      </w:r>
+    </w:p>
+    <w:p>
+      <w:r>
+        <w:br w:type="page"/>
       </w:r>
     </w:p>
     <w:p>
@@ -4029,7 +3850,7 @@
         <w:drawing>
           <wp:inline xmlns:a="http://schemas.openxmlformats.org/drawingml/2006/main" xmlns:pic="http://schemas.openxmlformats.org/drawingml/2006/picture">
             <wp:extent cx="5303520" cy="2983230"/>
-            <wp:docPr id="23" name="Picture 23"/>
+            <wp:docPr id="20" name="Picture 20"/>
             <wp:cNvGraphicFramePr>
               <a:graphicFrameLocks noChangeAspect="1"/>
             </wp:cNvGraphicFramePr>
@@ -4074,7 +3895,186 @@
           <w:color w:val="5B6570"/>
           <w:sz w:val="18"/>
         </w:rPr>
-        <w:t>UI-10. 08 Processing.</w:t>
+        <w:t>UI-07. 08 Processing.</w:t>
+      </w:r>
+    </w:p>
+    <w:p>
+      <w:pPr>
+        <w:keepNext/>
+        <w:spacing w:before="120" w:after="0"/>
+        <w:jc w:val="center"/>
+      </w:pPr>
+      <w:r>
+        <w:drawing>
+          <wp:inline xmlns:a="http://schemas.openxmlformats.org/drawingml/2006/main" xmlns:pic="http://schemas.openxmlformats.org/drawingml/2006/picture">
+            <wp:extent cx="5303520" cy="2983230"/>
+            <wp:docPr id="21" name="Picture 21"/>
+            <wp:cNvGraphicFramePr>
+              <a:graphicFrameLocks noChangeAspect="1"/>
+            </wp:cNvGraphicFramePr>
+            <a:graphic>
+              <a:graphicData uri="http://schemas.openxmlformats.org/drawingml/2006/picture">
+                <pic:pic>
+                  <pic:nvPicPr>
+                    <pic:cNvPr id="0" name="09-final-version-1.png"/>
+                    <pic:cNvPicPr/>
+                  </pic:nvPicPr>
+                  <pic:blipFill>
+                    <a:blip r:embed="rId27"/>
+                    <a:stretch>
+                      <a:fillRect/>
+                    </a:stretch>
+                  </pic:blipFill>
+                  <pic:spPr>
+                    <a:xfrm>
+                      <a:off x="0" y="0"/>
+                      <a:ext cx="5303520" cy="2983230"/>
+                    </a:xfrm>
+                    <a:prstGeom prst="rect"/>
+                  </pic:spPr>
+                </pic:pic>
+              </a:graphicData>
+            </a:graphic>
+          </wp:inline>
+        </w:drawing>
+      </w:r>
+    </w:p>
+    <w:p>
+      <w:pPr>
+        <w:pStyle w:val="Caption"/>
+        <w:keepNext w:val="0"/>
+        <w:spacing w:before="80" w:after="160"/>
+        <w:jc w:val="center"/>
+      </w:pPr>
+      <w:r>
+        <w:rPr>
+          <w:rFonts w:ascii="Calibri" w:hAnsi="Calibri"/>
+          <w:i/>
+          <w:color w:val="5B6570"/>
+          <w:sz w:val="18"/>
+        </w:rPr>
+        <w:t>UI-08. 09 Final Version 1.</w:t>
+      </w:r>
+    </w:p>
+    <w:p>
+      <w:r>
+        <w:br w:type="page"/>
+      </w:r>
+    </w:p>
+    <w:p>
+      <w:pPr>
+        <w:keepNext/>
+        <w:spacing w:before="120" w:after="0"/>
+        <w:jc w:val="center"/>
+      </w:pPr>
+      <w:r>
+        <w:drawing>
+          <wp:inline xmlns:a="http://schemas.openxmlformats.org/drawingml/2006/main" xmlns:pic="http://schemas.openxmlformats.org/drawingml/2006/picture">
+            <wp:extent cx="5303520" cy="2983230"/>
+            <wp:docPr id="22" name="Picture 22"/>
+            <wp:cNvGraphicFramePr>
+              <a:graphicFrameLocks noChangeAspect="1"/>
+            </wp:cNvGraphicFramePr>
+            <a:graphic>
+              <a:graphicData uri="http://schemas.openxmlformats.org/drawingml/2006/picture">
+                <pic:pic>
+                  <pic:nvPicPr>
+                    <pic:cNvPr id="0" name="09-final-versions-top.png"/>
+                    <pic:cNvPicPr/>
+                  </pic:nvPicPr>
+                  <pic:blipFill>
+                    <a:blip r:embed="rId28"/>
+                    <a:stretch>
+                      <a:fillRect/>
+                    </a:stretch>
+                  </pic:blipFill>
+                  <pic:spPr>
+                    <a:xfrm>
+                      <a:off x="0" y="0"/>
+                      <a:ext cx="5303520" cy="2983230"/>
+                    </a:xfrm>
+                    <a:prstGeom prst="rect"/>
+                  </pic:spPr>
+                </pic:pic>
+              </a:graphicData>
+            </a:graphic>
+          </wp:inline>
+        </w:drawing>
+      </w:r>
+    </w:p>
+    <w:p>
+      <w:pPr>
+        <w:pStyle w:val="Caption"/>
+        <w:keepNext w:val="0"/>
+        <w:spacing w:before="80" w:after="160"/>
+        <w:jc w:val="center"/>
+      </w:pPr>
+      <w:r>
+        <w:rPr>
+          <w:rFonts w:ascii="Calibri" w:hAnsi="Calibri"/>
+          <w:i/>
+          <w:color w:val="5B6570"/>
+          <w:sz w:val="18"/>
+        </w:rPr>
+        <w:t>UI-09. 09 Final Versions Top.</w:t>
+      </w:r>
+    </w:p>
+    <w:p>
+      <w:pPr>
+        <w:keepNext/>
+        <w:spacing w:before="120" w:after="0"/>
+        <w:jc w:val="center"/>
+      </w:pPr>
+      <w:r>
+        <w:drawing>
+          <wp:inline xmlns:a="http://schemas.openxmlformats.org/drawingml/2006/main" xmlns:pic="http://schemas.openxmlformats.org/drawingml/2006/picture">
+            <wp:extent cx="5303520" cy="2983230"/>
+            <wp:docPr id="23" name="Picture 23"/>
+            <wp:cNvGraphicFramePr>
+              <a:graphicFrameLocks noChangeAspect="1"/>
+            </wp:cNvGraphicFramePr>
+            <a:graphic>
+              <a:graphicData uri="http://schemas.openxmlformats.org/drawingml/2006/picture">
+                <pic:pic>
+                  <pic:nvPicPr>
+                    <pic:cNvPr id="0" name="10-final-version-1.png"/>
+                    <pic:cNvPicPr/>
+                  </pic:nvPicPr>
+                  <pic:blipFill>
+                    <a:blip r:embed="rId29"/>
+                    <a:stretch>
+                      <a:fillRect/>
+                    </a:stretch>
+                  </pic:blipFill>
+                  <pic:spPr>
+                    <a:xfrm>
+                      <a:off x="0" y="0"/>
+                      <a:ext cx="5303520" cy="2983230"/>
+                    </a:xfrm>
+                    <a:prstGeom prst="rect"/>
+                  </pic:spPr>
+                </pic:pic>
+              </a:graphicData>
+            </a:graphic>
+          </wp:inline>
+        </w:drawing>
+      </w:r>
+    </w:p>
+    <w:p>
+      <w:pPr>
+        <w:pStyle w:val="Caption"/>
+        <w:keepNext w:val="0"/>
+        <w:spacing w:before="80" w:after="160"/>
+        <w:jc w:val="center"/>
+      </w:pPr>
+      <w:r>
+        <w:rPr>
+          <w:rFonts w:ascii="Calibri" w:hAnsi="Calibri"/>
+          <w:i/>
+          <w:color w:val="5B6570"/>
+          <w:sz w:val="18"/>
+        </w:rPr>
+        <w:t>UI-10. 10 Final Version 1.</w:t>
       </w:r>
     </w:p>
     <w:p>
@@ -4100,7 +4100,7 @@
               <a:graphicData uri="http://schemas.openxmlformats.org/drawingml/2006/picture">
                 <pic:pic>
                   <pic:nvPicPr>
-                    <pic:cNvPr id="0" name="09-final-version-1.png"/>
+                    <pic:cNvPr id="0" name="10-final-version-playing.png"/>
                     <pic:cNvPicPr/>
                   </pic:nvPicPr>
                   <pic:blipFill>
@@ -4137,7 +4137,7 @@
           <w:color w:val="5B6570"/>
           <w:sz w:val="18"/>
         </w:rPr>
-        <w:t>UI-11. 09 Final Version 1.</w:t>
+        <w:t>UI-11. 10 Final Version Playing.</w:t>
       </w:r>
     </w:p>
     <w:p>
@@ -4158,7 +4158,7 @@
               <a:graphicData uri="http://schemas.openxmlformats.org/drawingml/2006/picture">
                 <pic:pic>
                   <pic:nvPicPr>
-                    <pic:cNvPr id="0" name="09-final-versions-top.png"/>
+                    <pic:cNvPr id="0" name="11-final-version-2.png"/>
                     <pic:cNvPicPr/>
                   </pic:nvPicPr>
                   <pic:blipFill>
@@ -4195,7 +4195,7 @@
           <w:color w:val="5B6570"/>
           <w:sz w:val="18"/>
         </w:rPr>
-        <w:t>UI-12. 09 Final Versions Top.</w:t>
+        <w:t>UI-12. 11 Final Version 2.</w:t>
       </w:r>
     </w:p>
     <w:p>
@@ -4221,7 +4221,7 @@
               <a:graphicData uri="http://schemas.openxmlformats.org/drawingml/2006/picture">
                 <pic:pic>
                   <pic:nvPicPr>
-                    <pic:cNvPr id="0" name="10-final-version-1.png"/>
+                    <pic:cNvPr id="0" name="12-final-version-3.png"/>
                     <pic:cNvPicPr/>
                   </pic:nvPicPr>
                   <pic:blipFill>
@@ -4258,7 +4258,7 @@
           <w:color w:val="5B6570"/>
           <w:sz w:val="18"/>
         </w:rPr>
-        <w:t>UI-13. 10 Final Version 1.</w:t>
+        <w:t>UI-13. 12 Final Version 3.</w:t>
       </w:r>
     </w:p>
     <w:p>
@@ -4279,7 +4279,7 @@
               <a:graphicData uri="http://schemas.openxmlformats.org/drawingml/2006/picture">
                 <pic:pic>
                   <pic:nvPicPr>
-                    <pic:cNvPr id="0" name="10-final-version-playing.png"/>
+                    <pic:cNvPr id="0" name="13-final-version-4.png"/>
                     <pic:cNvPicPr/>
                   </pic:nvPicPr>
                   <pic:blipFill>
@@ -4316,7 +4316,7 @@
           <w:color w:val="5B6570"/>
           <w:sz w:val="18"/>
         </w:rPr>
-        <w:t>UI-14. 10 Final Version Playing.</w:t>
+        <w:t>UI-14. 13 Final Version 4.</w:t>
       </w:r>
     </w:p>
     <w:p>
@@ -4342,7 +4342,7 @@
               <a:graphicData uri="http://schemas.openxmlformats.org/drawingml/2006/picture">
                 <pic:pic>
                   <pic:nvPicPr>
-                    <pic:cNvPr id="0" name="11-final-version-2.png"/>
+                    <pic:cNvPr id="0" name="14-final-version-5.png"/>
                     <pic:cNvPicPr/>
                   </pic:nvPicPr>
                   <pic:blipFill>
@@ -4379,7 +4379,7 @@
           <w:color w:val="5B6570"/>
           <w:sz w:val="18"/>
         </w:rPr>
-        <w:t>UI-15. 11 Final Version 2.</w:t>
+        <w:t>UI-15. 14 Final Version 5.</w:t>
       </w:r>
     </w:p>
     <w:p>
@@ -4400,7 +4400,7 @@
               <a:graphicData uri="http://schemas.openxmlformats.org/drawingml/2006/picture">
                 <pic:pic>
                   <pic:nvPicPr>
-                    <pic:cNvPr id="0" name="12-final-version-3.png"/>
+                    <pic:cNvPr id="0" name="15-export-studio.png"/>
                     <pic:cNvPicPr/>
                   </pic:nvPicPr>
                   <pic:blipFill>
@@ -4437,7 +4437,7 @@
           <w:color w:val="5B6570"/>
           <w:sz w:val="18"/>
         </w:rPr>
-        <w:t>UI-16. 12 Final Version 3.</w:t>
+        <w:t>UI-16. 15 Export Studio.</w:t>
       </w:r>
     </w:p>
     <w:p>
@@ -4463,7 +4463,7 @@
               <a:graphicData uri="http://schemas.openxmlformats.org/drawingml/2006/picture">
                 <pic:pic>
                   <pic:nvPicPr>
-                    <pic:cNvPr id="0" name="13-final-version-4.png"/>
+                    <pic:cNvPr id="0" name="16-home-after-generation.png"/>
                     <pic:cNvPicPr/>
                   </pic:nvPicPr>
                   <pic:blipFill>
@@ -4500,7 +4500,7 @@
           <w:color w:val="5B6570"/>
           <w:sz w:val="18"/>
         </w:rPr>
-        <w:t>UI-17. 13 Final Version 4.</w:t>
+        <w:t>UI-17. 16 Home After Generation.</w:t>
       </w:r>
     </w:p>
     <w:p>
@@ -4521,7 +4521,7 @@
               <a:graphicData uri="http://schemas.openxmlformats.org/drawingml/2006/picture">
                 <pic:pic>
                   <pic:nvPicPr>
-                    <pic:cNvPr id="0" name="14-final-version-5.png"/>
+                    <pic:cNvPr id="0" name="17-track-library.png"/>
                     <pic:cNvPicPr/>
                   </pic:nvPicPr>
                   <pic:blipFill>
@@ -4558,7 +4558,7 @@
           <w:color w:val="5B6570"/>
           <w:sz w:val="18"/>
         </w:rPr>
-        <w:t>UI-18. 14 Final Version 5.</w:t>
+        <w:t>UI-18. 17 Track Library.</w:t>
       </w:r>
     </w:p>
     <w:p>
@@ -4584,7 +4584,7 @@
               <a:graphicData uri="http://schemas.openxmlformats.org/drawingml/2006/picture">
                 <pic:pic>
                   <pic:nvPicPr>
-                    <pic:cNvPr id="0" name="15-export-studio.png"/>
+                    <pic:cNvPr id="0" name="18-guest-profile.png"/>
                     <pic:cNvPicPr/>
                   </pic:nvPicPr>
                   <pic:blipFill>
@@ -4621,7 +4621,7 @@
           <w:color w:val="5B6570"/>
           <w:sz w:val="18"/>
         </w:rPr>
-        <w:t>UI-19. 15 Export Studio.</w:t>
+        <w:t>UI-19. 18 Guest Profile.</w:t>
       </w:r>
     </w:p>
     <w:p>
@@ -4635,190 +4635,6 @@
           <wp:inline xmlns:a="http://schemas.openxmlformats.org/drawingml/2006/main" xmlns:pic="http://schemas.openxmlformats.org/drawingml/2006/picture">
             <wp:extent cx="5303520" cy="2983230"/>
             <wp:docPr id="33" name="Picture 33"/>
-            <wp:cNvGraphicFramePr>
-              <a:graphicFrameLocks noChangeAspect="1"/>
-            </wp:cNvGraphicFramePr>
-            <a:graphic>
-              <a:graphicData uri="http://schemas.openxmlformats.org/drawingml/2006/picture">
-                <pic:pic>
-                  <pic:nvPicPr>
-                    <pic:cNvPr id="0" name="16-home-after-generation.png"/>
-                    <pic:cNvPicPr/>
-                  </pic:nvPicPr>
-                  <pic:blipFill>
-                    <a:blip r:embed="rId39"/>
-                    <a:stretch>
-                      <a:fillRect/>
-                    </a:stretch>
-                  </pic:blipFill>
-                  <pic:spPr>
-                    <a:xfrm>
-                      <a:off x="0" y="0"/>
-                      <a:ext cx="5303520" cy="2983230"/>
-                    </a:xfrm>
-                    <a:prstGeom prst="rect"/>
-                  </pic:spPr>
-                </pic:pic>
-              </a:graphicData>
-            </a:graphic>
-          </wp:inline>
-        </w:drawing>
-      </w:r>
-    </w:p>
-    <w:p>
-      <w:pPr>
-        <w:pStyle w:val="Caption"/>
-        <w:keepNext w:val="0"/>
-        <w:spacing w:before="80" w:after="160"/>
-        <w:jc w:val="center"/>
-      </w:pPr>
-      <w:r>
-        <w:rPr>
-          <w:rFonts w:ascii="Calibri" w:hAnsi="Calibri"/>
-          <w:i/>
-          <w:color w:val="5B6570"/>
-          <w:sz w:val="18"/>
-        </w:rPr>
-        <w:t>UI-20. 16 Home After Generation.</w:t>
-      </w:r>
-    </w:p>
-    <w:p>
-      <w:r>
-        <w:br w:type="page"/>
-      </w:r>
-    </w:p>
-    <w:p>
-      <w:pPr>
-        <w:keepNext/>
-        <w:spacing w:before="120" w:after="0"/>
-        <w:jc w:val="center"/>
-      </w:pPr>
-      <w:r>
-        <w:drawing>
-          <wp:inline xmlns:a="http://schemas.openxmlformats.org/drawingml/2006/main" xmlns:pic="http://schemas.openxmlformats.org/drawingml/2006/picture">
-            <wp:extent cx="5303520" cy="2983230"/>
-            <wp:docPr id="34" name="Picture 34"/>
-            <wp:cNvGraphicFramePr>
-              <a:graphicFrameLocks noChangeAspect="1"/>
-            </wp:cNvGraphicFramePr>
-            <a:graphic>
-              <a:graphicData uri="http://schemas.openxmlformats.org/drawingml/2006/picture">
-                <pic:pic>
-                  <pic:nvPicPr>
-                    <pic:cNvPr id="0" name="17-track-library.png"/>
-                    <pic:cNvPicPr/>
-                  </pic:nvPicPr>
-                  <pic:blipFill>
-                    <a:blip r:embed="rId40"/>
-                    <a:stretch>
-                      <a:fillRect/>
-                    </a:stretch>
-                  </pic:blipFill>
-                  <pic:spPr>
-                    <a:xfrm>
-                      <a:off x="0" y="0"/>
-                      <a:ext cx="5303520" cy="2983230"/>
-                    </a:xfrm>
-                    <a:prstGeom prst="rect"/>
-                  </pic:spPr>
-                </pic:pic>
-              </a:graphicData>
-            </a:graphic>
-          </wp:inline>
-        </w:drawing>
-      </w:r>
-    </w:p>
-    <w:p>
-      <w:pPr>
-        <w:pStyle w:val="Caption"/>
-        <w:keepNext w:val="0"/>
-        <w:spacing w:before="80" w:after="160"/>
-        <w:jc w:val="center"/>
-      </w:pPr>
-      <w:r>
-        <w:rPr>
-          <w:rFonts w:ascii="Calibri" w:hAnsi="Calibri"/>
-          <w:i/>
-          <w:color w:val="5B6570"/>
-          <w:sz w:val="18"/>
-        </w:rPr>
-        <w:t>UI-21. 17 Track Library.</w:t>
-      </w:r>
-    </w:p>
-    <w:p>
-      <w:pPr>
-        <w:keepNext/>
-        <w:spacing w:before="120" w:after="0"/>
-        <w:jc w:val="center"/>
-      </w:pPr>
-      <w:r>
-        <w:drawing>
-          <wp:inline xmlns:a="http://schemas.openxmlformats.org/drawingml/2006/main" xmlns:pic="http://schemas.openxmlformats.org/drawingml/2006/picture">
-            <wp:extent cx="5303520" cy="2983230"/>
-            <wp:docPr id="35" name="Picture 35"/>
-            <wp:cNvGraphicFramePr>
-              <a:graphicFrameLocks noChangeAspect="1"/>
-            </wp:cNvGraphicFramePr>
-            <a:graphic>
-              <a:graphicData uri="http://schemas.openxmlformats.org/drawingml/2006/picture">
-                <pic:pic>
-                  <pic:nvPicPr>
-                    <pic:cNvPr id="0" name="18-guest-profile.png"/>
-                    <pic:cNvPicPr/>
-                  </pic:nvPicPr>
-                  <pic:blipFill>
-                    <a:blip r:embed="rId41"/>
-                    <a:stretch>
-                      <a:fillRect/>
-                    </a:stretch>
-                  </pic:blipFill>
-                  <pic:spPr>
-                    <a:xfrm>
-                      <a:off x="0" y="0"/>
-                      <a:ext cx="5303520" cy="2983230"/>
-                    </a:xfrm>
-                    <a:prstGeom prst="rect"/>
-                  </pic:spPr>
-                </pic:pic>
-              </a:graphicData>
-            </a:graphic>
-          </wp:inline>
-        </w:drawing>
-      </w:r>
-    </w:p>
-    <w:p>
-      <w:pPr>
-        <w:pStyle w:val="Caption"/>
-        <w:keepNext w:val="0"/>
-        <w:spacing w:before="80" w:after="160"/>
-        <w:jc w:val="center"/>
-      </w:pPr>
-      <w:r>
-        <w:rPr>
-          <w:rFonts w:ascii="Calibri" w:hAnsi="Calibri"/>
-          <w:i/>
-          <w:color w:val="5B6570"/>
-          <w:sz w:val="18"/>
-        </w:rPr>
-        <w:t>UI-22. 18 Guest Profile.</w:t>
-      </w:r>
-    </w:p>
-    <w:p>
-      <w:r>
-        <w:br w:type="page"/>
-      </w:r>
-    </w:p>
-    <w:p>
-      <w:pPr>
-        <w:keepNext/>
-        <w:spacing w:before="120" w:after="0"/>
-        <w:jc w:val="center"/>
-      </w:pPr>
-      <w:r>
-        <w:drawing>
-          <wp:inline xmlns:a="http://schemas.openxmlformats.org/drawingml/2006/main" xmlns:pic="http://schemas.openxmlformats.org/drawingml/2006/picture">
-            <wp:extent cx="5303520" cy="2983230"/>
-            <wp:docPr id="36" name="Picture 36"/>
             <wp:cNvGraphicFramePr>
               <a:graphicFrameLocks noChangeAspect="1"/>
             </wp:cNvGraphicFramePr>
@@ -4863,7 +4679,12 @@
           <w:color w:val="5B6570"/>
           <w:sz w:val="18"/>
         </w:rPr>
-        <w:t>UI-23. 19 Final Preview Added.</w:t>
+        <w:t>UI-20. 19 Final Preview Added.</w:t>
+      </w:r>
+    </w:p>
+    <w:p>
+      <w:r>
+        <w:br w:type="page"/>
       </w:r>
     </w:p>
     <w:p>
@@ -4876,7 +4697,7 @@
         <w:drawing>
           <wp:inline xmlns:a="http://schemas.openxmlformats.org/drawingml/2006/main" xmlns:pic="http://schemas.openxmlformats.org/drawingml/2006/picture">
             <wp:extent cx="5303520" cy="2983230"/>
-            <wp:docPr id="37" name="Picture 37"/>
+            <wp:docPr id="34" name="Picture 34"/>
             <wp:cNvGraphicFramePr>
               <a:graphicFrameLocks noChangeAspect="1"/>
             </wp:cNvGraphicFramePr>
@@ -4888,7 +4709,7 @@
                     <pic:cNvPicPr/>
                   </pic:nvPicPr>
                   <pic:blipFill>
-                    <a:blip r:embed="rId42"/>
+                    <a:blip r:embed="rId39"/>
                     <a:stretch>
                       <a:fillRect/>
                     </a:stretch>
@@ -4921,12 +4742,7 @@
           <w:color w:val="5B6570"/>
           <w:sz w:val="18"/>
         </w:rPr>
-        <w:t>UI-24. 20 Final Preview Playing.</w:t>
-      </w:r>
-    </w:p>
-    <w:p>
-      <w:r>
-        <w:br w:type="page"/>
+        <w:t>UI-21. 20 Final Preview Playing.</w:t>
       </w:r>
     </w:p>
     <w:p>
@@ -4939,7 +4755,7 @@
         <w:drawing>
           <wp:inline xmlns:a="http://schemas.openxmlformats.org/drawingml/2006/main" xmlns:pic="http://schemas.openxmlformats.org/drawingml/2006/picture">
             <wp:extent cx="5303520" cy="2983230"/>
-            <wp:docPr id="38" name="Picture 38"/>
+            <wp:docPr id="35" name="Picture 35"/>
             <wp:cNvGraphicFramePr>
               <a:graphicFrameLocks noChangeAspect="1"/>
             </wp:cNvGraphicFramePr>
@@ -4951,7 +4767,7 @@
                     <pic:cNvPicPr/>
                   </pic:nvPicPr>
                   <pic:blipFill>
-                    <a:blip r:embed="rId43"/>
+                    <a:blip r:embed="rId40"/>
                     <a:stretch>
                       <a:fillRect/>
                     </a:stretch>
@@ -4984,7 +4800,7 @@
           <w:color w:val="5B6570"/>
           <w:sz w:val="18"/>
         </w:rPr>
-        <w:t>UI-25. 21 Record Voice.</w:t>
+        <w:t>UI-22. 21 Record Voice.</w:t>
       </w:r>
     </w:p>
     <w:p>

</xml_diff>

<commit_message>
Remove cloud and account branches (#1)
</commit_message>
<xml_diff>
--- a/docs/research-report/Skarly_Research_Internship_Report.docx
+++ b/docs/research-report/Skarly_Research_Internship_Report.docx
@@ -783,14 +783,14 @@
           <w:b/>
           <w:color w:val="17202A"/>
         </w:rPr>
-        <w:t xml:space="preserve">Private upload. </w:t>
+        <w:t xml:space="preserve">Local upload. </w:t>
       </w:r>
       <w:r>
         <w:rPr>
           <w:rFonts w:ascii="Calibri" w:hAnsi="Calibri"/>
           <w:color w:val="17202A"/>
         </w:rPr>
-        <w:t>The client obtains an account- or guest-scoped upload path, transfers the audio, and verifies that it exists before analysis.</w:t>
+        <w:t>The guest client transfers the selected audio to local storage and verifies that it exists before analysis.</w:t>
       </w:r>
     </w:p>
     <w:p>
@@ -2012,7 +2012,7 @@
           <w:color w:val="5B6570"/>
           <w:sz w:val="18"/>
         </w:rPr>
-        <w:t>Figure 3. Real training and grouped-validation curves exported from skarly_audio_cnn.pt.</w:t>
+        <w:t>Figure 3. Real training and grouped-validation curves from the retained training-history export.</w:t>
       </w:r>
     </w:p>
     <w:p>
@@ -2355,7 +2355,7 @@
               <a:graphicData uri="http://schemas.openxmlformats.org/drawingml/2006/picture">
                 <pic:pic>
                   <pic:nvPicPr>
-                    <pic:cNvPr id="0" name="00-account-choice.png"/>
+                    <pic:cNvPr id="0" name="02-creator-setup.png"/>
                     <pic:cNvPicPr/>
                   </pic:nvPicPr>
                   <pic:blipFill>
@@ -2392,7 +2392,7 @@
           <w:color w:val="5B6570"/>
           <w:sz w:val="18"/>
         </w:rPr>
-        <w:t>Figure 8. Account choice with guest entry and saved-account options.</w:t>
+        <w:t>Figure 8. Local creator setup.</w:t>
       </w:r>
     </w:p>
     <w:p>
@@ -2413,7 +2413,7 @@
               <a:graphicData uri="http://schemas.openxmlformats.org/drawingml/2006/picture">
                 <pic:pic>
                   <pic:nvPicPr>
-                    <pic:cNvPr id="0" name="05-upload-selected.png"/>
+                    <pic:cNvPr id="0" name="04-upload-empty.png"/>
                     <pic:cNvPicPr/>
                   </pic:nvPicPr>
                   <pic:blipFill>
@@ -2450,7 +2450,7 @@
           <w:color w:val="5B6570"/>
           <w:sz w:val="18"/>
         </w:rPr>
-        <w:t>Figure 9. Supplied audio selected and verified for the guest workflow.</w:t>
+        <w:t>Figure 9. Local audio input and mode selection.</w:t>
       </w:r>
     </w:p>
     <w:p>
@@ -3433,7 +3433,7 @@
           <w:color w:val="17202A"/>
           <w:sz w:val="21"/>
         </w:rPr>
-        <w:t>Model weights, GPU drivers, FFmpeg, Firebase credentials, and cloud resources are environment-specific. The offline example files document the minimum variables without committing secrets.</w:t>
+        <w:t>ACE-Step weights, GPU drivers, FFmpeg, and local tool paths are environment-specific. The offline example files document the minimum variables without committing secrets.</w:t>
       </w:r>
     </w:p>
     <w:p>
@@ -3495,7 +3495,7 @@
               <a:graphicData uri="http://schemas.openxmlformats.org/drawingml/2006/picture">
                 <pic:pic>
                   <pic:nvPicPr>
-                    <pic:cNvPr id="0" name="00-account-choice.png"/>
+                    <pic:cNvPr id="0" name="02-creator-setup.png"/>
                     <pic:cNvPicPr/>
                   </pic:nvPicPr>
                   <pic:blipFill>
@@ -3532,7 +3532,7 @@
           <w:color w:val="5B6570"/>
           <w:sz w:val="18"/>
         </w:rPr>
-        <w:t>UI-01. 00 Account Choice.</w:t>
+        <w:t>UI-01. 02 Creator Setup.</w:t>
       </w:r>
     </w:p>
     <w:p>
@@ -3553,7 +3553,7 @@
               <a:graphicData uri="http://schemas.openxmlformats.org/drawingml/2006/picture">
                 <pic:pic>
                   <pic:nvPicPr>
-                    <pic:cNvPr id="0" name="01-guest-entry.png"/>
+                    <pic:cNvPr id="0" name="03-home.png"/>
                     <pic:cNvPicPr/>
                   </pic:nvPicPr>
                   <pic:blipFill>
@@ -3590,7 +3590,7 @@
           <w:color w:val="5B6570"/>
           <w:sz w:val="18"/>
         </w:rPr>
-        <w:t>UI-02. 01 Guest Entry.</w:t>
+        <w:t>UI-02. 03 Home.</w:t>
       </w:r>
     </w:p>
     <w:p>
@@ -3616,7 +3616,65 @@
               <a:graphicData uri="http://schemas.openxmlformats.org/drawingml/2006/picture">
                 <pic:pic>
                   <pic:nvPicPr>
-                    <pic:cNvPr id="0" name="02-creator-setup.png"/>
+                    <pic:cNvPr id="0" name="04-upload-empty.png"/>
+                    <pic:cNvPicPr/>
+                  </pic:nvPicPr>
+                  <pic:blipFill>
+                    <a:blip r:embed="rId20"/>
+                    <a:stretch>
+                      <a:fillRect/>
+                    </a:stretch>
+                  </pic:blipFill>
+                  <pic:spPr>
+                    <a:xfrm>
+                      <a:off x="0" y="0"/>
+                      <a:ext cx="5303520" cy="2983230"/>
+                    </a:xfrm>
+                    <a:prstGeom prst="rect"/>
+                  </pic:spPr>
+                </pic:pic>
+              </a:graphicData>
+            </a:graphic>
+          </wp:inline>
+        </w:drawing>
+      </w:r>
+    </w:p>
+    <w:p>
+      <w:pPr>
+        <w:pStyle w:val="Caption"/>
+        <w:keepNext w:val="0"/>
+        <w:spacing w:before="80" w:after="160"/>
+        <w:jc w:val="center"/>
+      </w:pPr>
+      <w:r>
+        <w:rPr>
+          <w:rFonts w:ascii="Calibri" w:hAnsi="Calibri"/>
+          <w:i/>
+          <w:color w:val="5B6570"/>
+          <w:sz w:val="18"/>
+        </w:rPr>
+        <w:t>UI-03. 04 Upload Empty.</w:t>
+      </w:r>
+    </w:p>
+    <w:p>
+      <w:pPr>
+        <w:keepNext/>
+        <w:spacing w:before="120" w:after="0"/>
+        <w:jc w:val="center"/>
+      </w:pPr>
+      <w:r>
+        <w:drawing>
+          <wp:inline xmlns:a="http://schemas.openxmlformats.org/drawingml/2006/main" xmlns:pic="http://schemas.openxmlformats.org/drawingml/2006/picture">
+            <wp:extent cx="5303520" cy="2983230"/>
+            <wp:docPr id="17" name="Picture 17"/>
+            <wp:cNvGraphicFramePr>
+              <a:graphicFrameLocks noChangeAspect="1"/>
+            </wp:cNvGraphicFramePr>
+            <a:graphic>
+              <a:graphicData uri="http://schemas.openxmlformats.org/drawingml/2006/picture">
+                <pic:pic>
+                  <pic:nvPicPr>
+                    <pic:cNvPr id="0" name="06-audio-analyzing.png"/>
                     <pic:cNvPicPr/>
                   </pic:nvPicPr>
                   <pic:blipFill>
@@ -3653,65 +3711,7 @@
           <w:color w:val="5B6570"/>
           <w:sz w:val="18"/>
         </w:rPr>
-        <w:t>UI-03. 02 Creator Setup.</w:t>
-      </w:r>
-    </w:p>
-    <w:p>
-      <w:pPr>
-        <w:keepNext/>
-        <w:spacing w:before="120" w:after="0"/>
-        <w:jc w:val="center"/>
-      </w:pPr>
-      <w:r>
-        <w:drawing>
-          <wp:inline xmlns:a="http://schemas.openxmlformats.org/drawingml/2006/main" xmlns:pic="http://schemas.openxmlformats.org/drawingml/2006/picture">
-            <wp:extent cx="5303520" cy="2983230"/>
-            <wp:docPr id="17" name="Picture 17"/>
-            <wp:cNvGraphicFramePr>
-              <a:graphicFrameLocks noChangeAspect="1"/>
-            </wp:cNvGraphicFramePr>
-            <a:graphic>
-              <a:graphicData uri="http://schemas.openxmlformats.org/drawingml/2006/picture">
-                <pic:pic>
-                  <pic:nvPicPr>
-                    <pic:cNvPr id="0" name="03-home.png"/>
-                    <pic:cNvPicPr/>
-                  </pic:nvPicPr>
-                  <pic:blipFill>
-                    <a:blip r:embed="rId26"/>
-                    <a:stretch>
-                      <a:fillRect/>
-                    </a:stretch>
-                  </pic:blipFill>
-                  <pic:spPr>
-                    <a:xfrm>
-                      <a:off x="0" y="0"/>
-                      <a:ext cx="5303520" cy="2983230"/>
-                    </a:xfrm>
-                    <a:prstGeom prst="rect"/>
-                  </pic:spPr>
-                </pic:pic>
-              </a:graphicData>
-            </a:graphic>
-          </wp:inline>
-        </w:drawing>
-      </w:r>
-    </w:p>
-    <w:p>
-      <w:pPr>
-        <w:pStyle w:val="Caption"/>
-        <w:keepNext w:val="0"/>
-        <w:spacing w:before="80" w:after="160"/>
-        <w:jc w:val="center"/>
-      </w:pPr>
-      <w:r>
-        <w:rPr>
-          <w:rFonts w:ascii="Calibri" w:hAnsi="Calibri"/>
-          <w:i/>
-          <w:color w:val="5B6570"/>
-          <w:sz w:val="18"/>
-        </w:rPr>
-        <w:t>UI-04. 03 Home.</w:t>
+        <w:t>UI-04. 06 Audio Analyzing.</w:t>
       </w:r>
     </w:p>
     <w:p>
@@ -3730,185 +3730,6 @@
           <wp:inline xmlns:a="http://schemas.openxmlformats.org/drawingml/2006/main" xmlns:pic="http://schemas.openxmlformats.org/drawingml/2006/picture">
             <wp:extent cx="5303520" cy="2983230"/>
             <wp:docPr id="18" name="Picture 18"/>
-            <wp:cNvGraphicFramePr>
-              <a:graphicFrameLocks noChangeAspect="1"/>
-            </wp:cNvGraphicFramePr>
-            <a:graphic>
-              <a:graphicData uri="http://schemas.openxmlformats.org/drawingml/2006/picture">
-                <pic:pic>
-                  <pic:nvPicPr>
-                    <pic:cNvPr id="0" name="04-upload-empty.png"/>
-                    <pic:cNvPicPr/>
-                  </pic:nvPicPr>
-                  <pic:blipFill>
-                    <a:blip r:embed="rId27"/>
-                    <a:stretch>
-                      <a:fillRect/>
-                    </a:stretch>
-                  </pic:blipFill>
-                  <pic:spPr>
-                    <a:xfrm>
-                      <a:off x="0" y="0"/>
-                      <a:ext cx="5303520" cy="2983230"/>
-                    </a:xfrm>
-                    <a:prstGeom prst="rect"/>
-                  </pic:spPr>
-                </pic:pic>
-              </a:graphicData>
-            </a:graphic>
-          </wp:inline>
-        </w:drawing>
-      </w:r>
-    </w:p>
-    <w:p>
-      <w:pPr>
-        <w:pStyle w:val="Caption"/>
-        <w:keepNext w:val="0"/>
-        <w:spacing w:before="80" w:after="160"/>
-        <w:jc w:val="center"/>
-      </w:pPr>
-      <w:r>
-        <w:rPr>
-          <w:rFonts w:ascii="Calibri" w:hAnsi="Calibri"/>
-          <w:i/>
-          <w:color w:val="5B6570"/>
-          <w:sz w:val="18"/>
-        </w:rPr>
-        <w:t>UI-05. 04 Upload Empty.</w:t>
-      </w:r>
-    </w:p>
-    <w:p>
-      <w:pPr>
-        <w:keepNext/>
-        <w:spacing w:before="120" w:after="0"/>
-        <w:jc w:val="center"/>
-      </w:pPr>
-      <w:r>
-        <w:drawing>
-          <wp:inline xmlns:a="http://schemas.openxmlformats.org/drawingml/2006/main" xmlns:pic="http://schemas.openxmlformats.org/drawingml/2006/picture">
-            <wp:extent cx="5303520" cy="2983230"/>
-            <wp:docPr id="19" name="Picture 19"/>
-            <wp:cNvGraphicFramePr>
-              <a:graphicFrameLocks noChangeAspect="1"/>
-            </wp:cNvGraphicFramePr>
-            <a:graphic>
-              <a:graphicData uri="http://schemas.openxmlformats.org/drawingml/2006/picture">
-                <pic:pic>
-                  <pic:nvPicPr>
-                    <pic:cNvPr id="0" name="05-upload-selected.png"/>
-                    <pic:cNvPicPr/>
-                  </pic:nvPicPr>
-                  <pic:blipFill>
-                    <a:blip r:embed="rId20"/>
-                    <a:stretch>
-                      <a:fillRect/>
-                    </a:stretch>
-                  </pic:blipFill>
-                  <pic:spPr>
-                    <a:xfrm>
-                      <a:off x="0" y="0"/>
-                      <a:ext cx="5303520" cy="2983230"/>
-                    </a:xfrm>
-                    <a:prstGeom prst="rect"/>
-                  </pic:spPr>
-                </pic:pic>
-              </a:graphicData>
-            </a:graphic>
-          </wp:inline>
-        </w:drawing>
-      </w:r>
-    </w:p>
-    <w:p>
-      <w:pPr>
-        <w:pStyle w:val="Caption"/>
-        <w:keepNext w:val="0"/>
-        <w:spacing w:before="80" w:after="160"/>
-        <w:jc w:val="center"/>
-      </w:pPr>
-      <w:r>
-        <w:rPr>
-          <w:rFonts w:ascii="Calibri" w:hAnsi="Calibri"/>
-          <w:i/>
-          <w:color w:val="5B6570"/>
-          <w:sz w:val="18"/>
-        </w:rPr>
-        <w:t>UI-06. 05 Upload Selected.</w:t>
-      </w:r>
-    </w:p>
-    <w:p>
-      <w:r>
-        <w:br w:type="page"/>
-      </w:r>
-    </w:p>
-    <w:p>
-      <w:pPr>
-        <w:keepNext/>
-        <w:spacing w:before="120" w:after="0"/>
-        <w:jc w:val="center"/>
-      </w:pPr>
-      <w:r>
-        <w:drawing>
-          <wp:inline xmlns:a="http://schemas.openxmlformats.org/drawingml/2006/main" xmlns:pic="http://schemas.openxmlformats.org/drawingml/2006/picture">
-            <wp:extent cx="5303520" cy="2983230"/>
-            <wp:docPr id="20" name="Picture 20"/>
-            <wp:cNvGraphicFramePr>
-              <a:graphicFrameLocks noChangeAspect="1"/>
-            </wp:cNvGraphicFramePr>
-            <a:graphic>
-              <a:graphicData uri="http://schemas.openxmlformats.org/drawingml/2006/picture">
-                <pic:pic>
-                  <pic:nvPicPr>
-                    <pic:cNvPr id="0" name="06-audio-analyzing.png"/>
-                    <pic:cNvPicPr/>
-                  </pic:nvPicPr>
-                  <pic:blipFill>
-                    <a:blip r:embed="rId28"/>
-                    <a:stretch>
-                      <a:fillRect/>
-                    </a:stretch>
-                  </pic:blipFill>
-                  <pic:spPr>
-                    <a:xfrm>
-                      <a:off x="0" y="0"/>
-                      <a:ext cx="5303520" cy="2983230"/>
-                    </a:xfrm>
-                    <a:prstGeom prst="rect"/>
-                  </pic:spPr>
-                </pic:pic>
-              </a:graphicData>
-            </a:graphic>
-          </wp:inline>
-        </w:drawing>
-      </w:r>
-    </w:p>
-    <w:p>
-      <w:pPr>
-        <w:pStyle w:val="Caption"/>
-        <w:keepNext w:val="0"/>
-        <w:spacing w:before="80" w:after="160"/>
-        <w:jc w:val="center"/>
-      </w:pPr>
-      <w:r>
-        <w:rPr>
-          <w:rFonts w:ascii="Calibri" w:hAnsi="Calibri"/>
-          <w:i/>
-          <w:color w:val="5B6570"/>
-          <w:sz w:val="18"/>
-        </w:rPr>
-        <w:t>UI-07. 06 Audio Analyzing.</w:t>
-      </w:r>
-    </w:p>
-    <w:p>
-      <w:pPr>
-        <w:keepNext/>
-        <w:spacing w:before="120" w:after="0"/>
-        <w:jc w:val="center"/>
-      </w:pPr>
-      <w:r>
-        <w:drawing>
-          <wp:inline xmlns:a="http://schemas.openxmlformats.org/drawingml/2006/main" xmlns:pic="http://schemas.openxmlformats.org/drawingml/2006/picture">
-            <wp:extent cx="5303520" cy="2983230"/>
-            <wp:docPr id="21" name="Picture 21"/>
             <wp:cNvGraphicFramePr>
               <a:graphicFrameLocks noChangeAspect="1"/>
             </wp:cNvGraphicFramePr>
@@ -3953,12 +3774,7 @@
           <w:color w:val="5B6570"/>
           <w:sz w:val="18"/>
         </w:rPr>
-        <w:t>UI-08. 06 Audio Detected.</w:t>
-      </w:r>
-    </w:p>
-    <w:p>
-      <w:r>
-        <w:br w:type="page"/>
+        <w:t>UI-05. 06 Audio Detected.</w:t>
       </w:r>
     </w:p>
     <w:p>
@@ -3971,7 +3787,7 @@
         <w:drawing>
           <wp:inline xmlns:a="http://schemas.openxmlformats.org/drawingml/2006/main" xmlns:pic="http://schemas.openxmlformats.org/drawingml/2006/picture">
             <wp:extent cx="5303520" cy="2983230"/>
-            <wp:docPr id="22" name="Picture 22"/>
+            <wp:docPr id="19" name="Picture 19"/>
             <wp:cNvGraphicFramePr>
               <a:graphicFrameLocks noChangeAspect="1"/>
             </wp:cNvGraphicFramePr>
@@ -3983,7 +3799,7 @@
                     <pic:cNvPicPr/>
                   </pic:nvPicPr>
                   <pic:blipFill>
-                    <a:blip r:embed="rId29"/>
+                    <a:blip r:embed="rId26"/>
                     <a:stretch>
                       <a:fillRect/>
                     </a:stretch>
@@ -4016,7 +3832,12 @@
           <w:color w:val="5B6570"/>
           <w:sz w:val="18"/>
         </w:rPr>
-        <w:t>UI-09. 07 Producer Selection.</w:t>
+        <w:t>UI-06. 07 Producer Selection.</w:t>
+      </w:r>
+    </w:p>
+    <w:p>
+      <w:r>
+        <w:br w:type="page"/>
       </w:r>
     </w:p>
     <w:p>
@@ -4029,7 +3850,7 @@
         <w:drawing>
           <wp:inline xmlns:a="http://schemas.openxmlformats.org/drawingml/2006/main" xmlns:pic="http://schemas.openxmlformats.org/drawingml/2006/picture">
             <wp:extent cx="5303520" cy="2983230"/>
-            <wp:docPr id="23" name="Picture 23"/>
+            <wp:docPr id="20" name="Picture 20"/>
             <wp:cNvGraphicFramePr>
               <a:graphicFrameLocks noChangeAspect="1"/>
             </wp:cNvGraphicFramePr>
@@ -4074,7 +3895,186 @@
           <w:color w:val="5B6570"/>
           <w:sz w:val="18"/>
         </w:rPr>
-        <w:t>UI-10. 08 Processing.</w:t>
+        <w:t>UI-07. 08 Processing.</w:t>
+      </w:r>
+    </w:p>
+    <w:p>
+      <w:pPr>
+        <w:keepNext/>
+        <w:spacing w:before="120" w:after="0"/>
+        <w:jc w:val="center"/>
+      </w:pPr>
+      <w:r>
+        <w:drawing>
+          <wp:inline xmlns:a="http://schemas.openxmlformats.org/drawingml/2006/main" xmlns:pic="http://schemas.openxmlformats.org/drawingml/2006/picture">
+            <wp:extent cx="5303520" cy="2983230"/>
+            <wp:docPr id="21" name="Picture 21"/>
+            <wp:cNvGraphicFramePr>
+              <a:graphicFrameLocks noChangeAspect="1"/>
+            </wp:cNvGraphicFramePr>
+            <a:graphic>
+              <a:graphicData uri="http://schemas.openxmlformats.org/drawingml/2006/picture">
+                <pic:pic>
+                  <pic:nvPicPr>
+                    <pic:cNvPr id="0" name="09-final-version-1.png"/>
+                    <pic:cNvPicPr/>
+                  </pic:nvPicPr>
+                  <pic:blipFill>
+                    <a:blip r:embed="rId27"/>
+                    <a:stretch>
+                      <a:fillRect/>
+                    </a:stretch>
+                  </pic:blipFill>
+                  <pic:spPr>
+                    <a:xfrm>
+                      <a:off x="0" y="0"/>
+                      <a:ext cx="5303520" cy="2983230"/>
+                    </a:xfrm>
+                    <a:prstGeom prst="rect"/>
+                  </pic:spPr>
+                </pic:pic>
+              </a:graphicData>
+            </a:graphic>
+          </wp:inline>
+        </w:drawing>
+      </w:r>
+    </w:p>
+    <w:p>
+      <w:pPr>
+        <w:pStyle w:val="Caption"/>
+        <w:keepNext w:val="0"/>
+        <w:spacing w:before="80" w:after="160"/>
+        <w:jc w:val="center"/>
+      </w:pPr>
+      <w:r>
+        <w:rPr>
+          <w:rFonts w:ascii="Calibri" w:hAnsi="Calibri"/>
+          <w:i/>
+          <w:color w:val="5B6570"/>
+          <w:sz w:val="18"/>
+        </w:rPr>
+        <w:t>UI-08. 09 Final Version 1.</w:t>
+      </w:r>
+    </w:p>
+    <w:p>
+      <w:r>
+        <w:br w:type="page"/>
+      </w:r>
+    </w:p>
+    <w:p>
+      <w:pPr>
+        <w:keepNext/>
+        <w:spacing w:before="120" w:after="0"/>
+        <w:jc w:val="center"/>
+      </w:pPr>
+      <w:r>
+        <w:drawing>
+          <wp:inline xmlns:a="http://schemas.openxmlformats.org/drawingml/2006/main" xmlns:pic="http://schemas.openxmlformats.org/drawingml/2006/picture">
+            <wp:extent cx="5303520" cy="2983230"/>
+            <wp:docPr id="22" name="Picture 22"/>
+            <wp:cNvGraphicFramePr>
+              <a:graphicFrameLocks noChangeAspect="1"/>
+            </wp:cNvGraphicFramePr>
+            <a:graphic>
+              <a:graphicData uri="http://schemas.openxmlformats.org/drawingml/2006/picture">
+                <pic:pic>
+                  <pic:nvPicPr>
+                    <pic:cNvPr id="0" name="09-final-versions-top.png"/>
+                    <pic:cNvPicPr/>
+                  </pic:nvPicPr>
+                  <pic:blipFill>
+                    <a:blip r:embed="rId28"/>
+                    <a:stretch>
+                      <a:fillRect/>
+                    </a:stretch>
+                  </pic:blipFill>
+                  <pic:spPr>
+                    <a:xfrm>
+                      <a:off x="0" y="0"/>
+                      <a:ext cx="5303520" cy="2983230"/>
+                    </a:xfrm>
+                    <a:prstGeom prst="rect"/>
+                  </pic:spPr>
+                </pic:pic>
+              </a:graphicData>
+            </a:graphic>
+          </wp:inline>
+        </w:drawing>
+      </w:r>
+    </w:p>
+    <w:p>
+      <w:pPr>
+        <w:pStyle w:val="Caption"/>
+        <w:keepNext w:val="0"/>
+        <w:spacing w:before="80" w:after="160"/>
+        <w:jc w:val="center"/>
+      </w:pPr>
+      <w:r>
+        <w:rPr>
+          <w:rFonts w:ascii="Calibri" w:hAnsi="Calibri"/>
+          <w:i/>
+          <w:color w:val="5B6570"/>
+          <w:sz w:val="18"/>
+        </w:rPr>
+        <w:t>UI-09. 09 Final Versions Top.</w:t>
+      </w:r>
+    </w:p>
+    <w:p>
+      <w:pPr>
+        <w:keepNext/>
+        <w:spacing w:before="120" w:after="0"/>
+        <w:jc w:val="center"/>
+      </w:pPr>
+      <w:r>
+        <w:drawing>
+          <wp:inline xmlns:a="http://schemas.openxmlformats.org/drawingml/2006/main" xmlns:pic="http://schemas.openxmlformats.org/drawingml/2006/picture">
+            <wp:extent cx="5303520" cy="2983230"/>
+            <wp:docPr id="23" name="Picture 23"/>
+            <wp:cNvGraphicFramePr>
+              <a:graphicFrameLocks noChangeAspect="1"/>
+            </wp:cNvGraphicFramePr>
+            <a:graphic>
+              <a:graphicData uri="http://schemas.openxmlformats.org/drawingml/2006/picture">
+                <pic:pic>
+                  <pic:nvPicPr>
+                    <pic:cNvPr id="0" name="10-final-version-1.png"/>
+                    <pic:cNvPicPr/>
+                  </pic:nvPicPr>
+                  <pic:blipFill>
+                    <a:blip r:embed="rId29"/>
+                    <a:stretch>
+                      <a:fillRect/>
+                    </a:stretch>
+                  </pic:blipFill>
+                  <pic:spPr>
+                    <a:xfrm>
+                      <a:off x="0" y="0"/>
+                      <a:ext cx="5303520" cy="2983230"/>
+                    </a:xfrm>
+                    <a:prstGeom prst="rect"/>
+                  </pic:spPr>
+                </pic:pic>
+              </a:graphicData>
+            </a:graphic>
+          </wp:inline>
+        </w:drawing>
+      </w:r>
+    </w:p>
+    <w:p>
+      <w:pPr>
+        <w:pStyle w:val="Caption"/>
+        <w:keepNext w:val="0"/>
+        <w:spacing w:before="80" w:after="160"/>
+        <w:jc w:val="center"/>
+      </w:pPr>
+      <w:r>
+        <w:rPr>
+          <w:rFonts w:ascii="Calibri" w:hAnsi="Calibri"/>
+          <w:i/>
+          <w:color w:val="5B6570"/>
+          <w:sz w:val="18"/>
+        </w:rPr>
+        <w:t>UI-10. 10 Final Version 1.</w:t>
       </w:r>
     </w:p>
     <w:p>
@@ -4100,7 +4100,7 @@
               <a:graphicData uri="http://schemas.openxmlformats.org/drawingml/2006/picture">
                 <pic:pic>
                   <pic:nvPicPr>
-                    <pic:cNvPr id="0" name="09-final-version-1.png"/>
+                    <pic:cNvPr id="0" name="10-final-version-playing.png"/>
                     <pic:cNvPicPr/>
                   </pic:nvPicPr>
                   <pic:blipFill>
@@ -4137,7 +4137,7 @@
           <w:color w:val="5B6570"/>
           <w:sz w:val="18"/>
         </w:rPr>
-        <w:t>UI-11. 09 Final Version 1.</w:t>
+        <w:t>UI-11. 10 Final Version Playing.</w:t>
       </w:r>
     </w:p>
     <w:p>
@@ -4158,7 +4158,7 @@
               <a:graphicData uri="http://schemas.openxmlformats.org/drawingml/2006/picture">
                 <pic:pic>
                   <pic:nvPicPr>
-                    <pic:cNvPr id="0" name="09-final-versions-top.png"/>
+                    <pic:cNvPr id="0" name="11-final-version-2.png"/>
                     <pic:cNvPicPr/>
                   </pic:nvPicPr>
                   <pic:blipFill>
@@ -4195,7 +4195,7 @@
           <w:color w:val="5B6570"/>
           <w:sz w:val="18"/>
         </w:rPr>
-        <w:t>UI-12. 09 Final Versions Top.</w:t>
+        <w:t>UI-12. 11 Final Version 2.</w:t>
       </w:r>
     </w:p>
     <w:p>
@@ -4221,7 +4221,7 @@
               <a:graphicData uri="http://schemas.openxmlformats.org/drawingml/2006/picture">
                 <pic:pic>
                   <pic:nvPicPr>
-                    <pic:cNvPr id="0" name="10-final-version-1.png"/>
+                    <pic:cNvPr id="0" name="12-final-version-3.png"/>
                     <pic:cNvPicPr/>
                   </pic:nvPicPr>
                   <pic:blipFill>
@@ -4258,7 +4258,7 @@
           <w:color w:val="5B6570"/>
           <w:sz w:val="18"/>
         </w:rPr>
-        <w:t>UI-13. 10 Final Version 1.</w:t>
+        <w:t>UI-13. 12 Final Version 3.</w:t>
       </w:r>
     </w:p>
     <w:p>
@@ -4279,7 +4279,7 @@
               <a:graphicData uri="http://schemas.openxmlformats.org/drawingml/2006/picture">
                 <pic:pic>
                   <pic:nvPicPr>
-                    <pic:cNvPr id="0" name="10-final-version-playing.png"/>
+                    <pic:cNvPr id="0" name="13-final-version-4.png"/>
                     <pic:cNvPicPr/>
                   </pic:nvPicPr>
                   <pic:blipFill>
@@ -4316,7 +4316,7 @@
           <w:color w:val="5B6570"/>
           <w:sz w:val="18"/>
         </w:rPr>
-        <w:t>UI-14. 10 Final Version Playing.</w:t>
+        <w:t>UI-14. 13 Final Version 4.</w:t>
       </w:r>
     </w:p>
     <w:p>
@@ -4342,7 +4342,7 @@
               <a:graphicData uri="http://schemas.openxmlformats.org/drawingml/2006/picture">
                 <pic:pic>
                   <pic:nvPicPr>
-                    <pic:cNvPr id="0" name="11-final-version-2.png"/>
+                    <pic:cNvPr id="0" name="14-final-version-5.png"/>
                     <pic:cNvPicPr/>
                   </pic:nvPicPr>
                   <pic:blipFill>
@@ -4379,7 +4379,7 @@
           <w:color w:val="5B6570"/>
           <w:sz w:val="18"/>
         </w:rPr>
-        <w:t>UI-15. 11 Final Version 2.</w:t>
+        <w:t>UI-15. 14 Final Version 5.</w:t>
       </w:r>
     </w:p>
     <w:p>
@@ -4400,7 +4400,7 @@
               <a:graphicData uri="http://schemas.openxmlformats.org/drawingml/2006/picture">
                 <pic:pic>
                   <pic:nvPicPr>
-                    <pic:cNvPr id="0" name="12-final-version-3.png"/>
+                    <pic:cNvPr id="0" name="15-export-studio.png"/>
                     <pic:cNvPicPr/>
                   </pic:nvPicPr>
                   <pic:blipFill>
@@ -4437,7 +4437,7 @@
           <w:color w:val="5B6570"/>
           <w:sz w:val="18"/>
         </w:rPr>
-        <w:t>UI-16. 12 Final Version 3.</w:t>
+        <w:t>UI-16. 15 Export Studio.</w:t>
       </w:r>
     </w:p>
     <w:p>
@@ -4463,7 +4463,7 @@
               <a:graphicData uri="http://schemas.openxmlformats.org/drawingml/2006/picture">
                 <pic:pic>
                   <pic:nvPicPr>
-                    <pic:cNvPr id="0" name="13-final-version-4.png"/>
+                    <pic:cNvPr id="0" name="16-home-after-generation.png"/>
                     <pic:cNvPicPr/>
                   </pic:nvPicPr>
                   <pic:blipFill>
@@ -4500,7 +4500,7 @@
           <w:color w:val="5B6570"/>
           <w:sz w:val="18"/>
         </w:rPr>
-        <w:t>UI-17. 13 Final Version 4.</w:t>
+        <w:t>UI-17. 16 Home After Generation.</w:t>
       </w:r>
     </w:p>
     <w:p>
@@ -4521,7 +4521,7 @@
               <a:graphicData uri="http://schemas.openxmlformats.org/drawingml/2006/picture">
                 <pic:pic>
                   <pic:nvPicPr>
-                    <pic:cNvPr id="0" name="14-final-version-5.png"/>
+                    <pic:cNvPr id="0" name="17-track-library.png"/>
                     <pic:cNvPicPr/>
                   </pic:nvPicPr>
                   <pic:blipFill>
@@ -4558,7 +4558,7 @@
           <w:color w:val="5B6570"/>
           <w:sz w:val="18"/>
         </w:rPr>
-        <w:t>UI-18. 14 Final Version 5.</w:t>
+        <w:t>UI-18. 17 Track Library.</w:t>
       </w:r>
     </w:p>
     <w:p>
@@ -4584,7 +4584,7 @@
               <a:graphicData uri="http://schemas.openxmlformats.org/drawingml/2006/picture">
                 <pic:pic>
                   <pic:nvPicPr>
-                    <pic:cNvPr id="0" name="15-export-studio.png"/>
+                    <pic:cNvPr id="0" name="18-guest-profile.png"/>
                     <pic:cNvPicPr/>
                   </pic:nvPicPr>
                   <pic:blipFill>
@@ -4621,7 +4621,7 @@
           <w:color w:val="5B6570"/>
           <w:sz w:val="18"/>
         </w:rPr>
-        <w:t>UI-19. 15 Export Studio.</w:t>
+        <w:t>UI-19. 18 Guest Profile.</w:t>
       </w:r>
     </w:p>
     <w:p>
@@ -4635,190 +4635,6 @@
           <wp:inline xmlns:a="http://schemas.openxmlformats.org/drawingml/2006/main" xmlns:pic="http://schemas.openxmlformats.org/drawingml/2006/picture">
             <wp:extent cx="5303520" cy="2983230"/>
             <wp:docPr id="33" name="Picture 33"/>
-            <wp:cNvGraphicFramePr>
-              <a:graphicFrameLocks noChangeAspect="1"/>
-            </wp:cNvGraphicFramePr>
-            <a:graphic>
-              <a:graphicData uri="http://schemas.openxmlformats.org/drawingml/2006/picture">
-                <pic:pic>
-                  <pic:nvPicPr>
-                    <pic:cNvPr id="0" name="16-home-after-generation.png"/>
-                    <pic:cNvPicPr/>
-                  </pic:nvPicPr>
-                  <pic:blipFill>
-                    <a:blip r:embed="rId39"/>
-                    <a:stretch>
-                      <a:fillRect/>
-                    </a:stretch>
-                  </pic:blipFill>
-                  <pic:spPr>
-                    <a:xfrm>
-                      <a:off x="0" y="0"/>
-                      <a:ext cx="5303520" cy="2983230"/>
-                    </a:xfrm>
-                    <a:prstGeom prst="rect"/>
-                  </pic:spPr>
-                </pic:pic>
-              </a:graphicData>
-            </a:graphic>
-          </wp:inline>
-        </w:drawing>
-      </w:r>
-    </w:p>
-    <w:p>
-      <w:pPr>
-        <w:pStyle w:val="Caption"/>
-        <w:keepNext w:val="0"/>
-        <w:spacing w:before="80" w:after="160"/>
-        <w:jc w:val="center"/>
-      </w:pPr>
-      <w:r>
-        <w:rPr>
-          <w:rFonts w:ascii="Calibri" w:hAnsi="Calibri"/>
-          <w:i/>
-          <w:color w:val="5B6570"/>
-          <w:sz w:val="18"/>
-        </w:rPr>
-        <w:t>UI-20. 16 Home After Generation.</w:t>
-      </w:r>
-    </w:p>
-    <w:p>
-      <w:r>
-        <w:br w:type="page"/>
-      </w:r>
-    </w:p>
-    <w:p>
-      <w:pPr>
-        <w:keepNext/>
-        <w:spacing w:before="120" w:after="0"/>
-        <w:jc w:val="center"/>
-      </w:pPr>
-      <w:r>
-        <w:drawing>
-          <wp:inline xmlns:a="http://schemas.openxmlformats.org/drawingml/2006/main" xmlns:pic="http://schemas.openxmlformats.org/drawingml/2006/picture">
-            <wp:extent cx="5303520" cy="2983230"/>
-            <wp:docPr id="34" name="Picture 34"/>
-            <wp:cNvGraphicFramePr>
-              <a:graphicFrameLocks noChangeAspect="1"/>
-            </wp:cNvGraphicFramePr>
-            <a:graphic>
-              <a:graphicData uri="http://schemas.openxmlformats.org/drawingml/2006/picture">
-                <pic:pic>
-                  <pic:nvPicPr>
-                    <pic:cNvPr id="0" name="17-track-library.png"/>
-                    <pic:cNvPicPr/>
-                  </pic:nvPicPr>
-                  <pic:blipFill>
-                    <a:blip r:embed="rId40"/>
-                    <a:stretch>
-                      <a:fillRect/>
-                    </a:stretch>
-                  </pic:blipFill>
-                  <pic:spPr>
-                    <a:xfrm>
-                      <a:off x="0" y="0"/>
-                      <a:ext cx="5303520" cy="2983230"/>
-                    </a:xfrm>
-                    <a:prstGeom prst="rect"/>
-                  </pic:spPr>
-                </pic:pic>
-              </a:graphicData>
-            </a:graphic>
-          </wp:inline>
-        </w:drawing>
-      </w:r>
-    </w:p>
-    <w:p>
-      <w:pPr>
-        <w:pStyle w:val="Caption"/>
-        <w:keepNext w:val="0"/>
-        <w:spacing w:before="80" w:after="160"/>
-        <w:jc w:val="center"/>
-      </w:pPr>
-      <w:r>
-        <w:rPr>
-          <w:rFonts w:ascii="Calibri" w:hAnsi="Calibri"/>
-          <w:i/>
-          <w:color w:val="5B6570"/>
-          <w:sz w:val="18"/>
-        </w:rPr>
-        <w:t>UI-21. 17 Track Library.</w:t>
-      </w:r>
-    </w:p>
-    <w:p>
-      <w:pPr>
-        <w:keepNext/>
-        <w:spacing w:before="120" w:after="0"/>
-        <w:jc w:val="center"/>
-      </w:pPr>
-      <w:r>
-        <w:drawing>
-          <wp:inline xmlns:a="http://schemas.openxmlformats.org/drawingml/2006/main" xmlns:pic="http://schemas.openxmlformats.org/drawingml/2006/picture">
-            <wp:extent cx="5303520" cy="2983230"/>
-            <wp:docPr id="35" name="Picture 35"/>
-            <wp:cNvGraphicFramePr>
-              <a:graphicFrameLocks noChangeAspect="1"/>
-            </wp:cNvGraphicFramePr>
-            <a:graphic>
-              <a:graphicData uri="http://schemas.openxmlformats.org/drawingml/2006/picture">
-                <pic:pic>
-                  <pic:nvPicPr>
-                    <pic:cNvPr id="0" name="18-guest-profile.png"/>
-                    <pic:cNvPicPr/>
-                  </pic:nvPicPr>
-                  <pic:blipFill>
-                    <a:blip r:embed="rId41"/>
-                    <a:stretch>
-                      <a:fillRect/>
-                    </a:stretch>
-                  </pic:blipFill>
-                  <pic:spPr>
-                    <a:xfrm>
-                      <a:off x="0" y="0"/>
-                      <a:ext cx="5303520" cy="2983230"/>
-                    </a:xfrm>
-                    <a:prstGeom prst="rect"/>
-                  </pic:spPr>
-                </pic:pic>
-              </a:graphicData>
-            </a:graphic>
-          </wp:inline>
-        </w:drawing>
-      </w:r>
-    </w:p>
-    <w:p>
-      <w:pPr>
-        <w:pStyle w:val="Caption"/>
-        <w:keepNext w:val="0"/>
-        <w:spacing w:before="80" w:after="160"/>
-        <w:jc w:val="center"/>
-      </w:pPr>
-      <w:r>
-        <w:rPr>
-          <w:rFonts w:ascii="Calibri" w:hAnsi="Calibri"/>
-          <w:i/>
-          <w:color w:val="5B6570"/>
-          <w:sz w:val="18"/>
-        </w:rPr>
-        <w:t>UI-22. 18 Guest Profile.</w:t>
-      </w:r>
-    </w:p>
-    <w:p>
-      <w:r>
-        <w:br w:type="page"/>
-      </w:r>
-    </w:p>
-    <w:p>
-      <w:pPr>
-        <w:keepNext/>
-        <w:spacing w:before="120" w:after="0"/>
-        <w:jc w:val="center"/>
-      </w:pPr>
-      <w:r>
-        <w:drawing>
-          <wp:inline xmlns:a="http://schemas.openxmlformats.org/drawingml/2006/main" xmlns:pic="http://schemas.openxmlformats.org/drawingml/2006/picture">
-            <wp:extent cx="5303520" cy="2983230"/>
-            <wp:docPr id="36" name="Picture 36"/>
             <wp:cNvGraphicFramePr>
               <a:graphicFrameLocks noChangeAspect="1"/>
             </wp:cNvGraphicFramePr>
@@ -4863,7 +4679,12 @@
           <w:color w:val="5B6570"/>
           <w:sz w:val="18"/>
         </w:rPr>
-        <w:t>UI-23. 19 Final Preview Added.</w:t>
+        <w:t>UI-20. 19 Final Preview Added.</w:t>
+      </w:r>
+    </w:p>
+    <w:p>
+      <w:r>
+        <w:br w:type="page"/>
       </w:r>
     </w:p>
     <w:p>
@@ -4876,7 +4697,7 @@
         <w:drawing>
           <wp:inline xmlns:a="http://schemas.openxmlformats.org/drawingml/2006/main" xmlns:pic="http://schemas.openxmlformats.org/drawingml/2006/picture">
             <wp:extent cx="5303520" cy="2983230"/>
-            <wp:docPr id="37" name="Picture 37"/>
+            <wp:docPr id="34" name="Picture 34"/>
             <wp:cNvGraphicFramePr>
               <a:graphicFrameLocks noChangeAspect="1"/>
             </wp:cNvGraphicFramePr>
@@ -4888,7 +4709,7 @@
                     <pic:cNvPicPr/>
                   </pic:nvPicPr>
                   <pic:blipFill>
-                    <a:blip r:embed="rId42"/>
+                    <a:blip r:embed="rId39"/>
                     <a:stretch>
                       <a:fillRect/>
                     </a:stretch>
@@ -4921,12 +4742,7 @@
           <w:color w:val="5B6570"/>
           <w:sz w:val="18"/>
         </w:rPr>
-        <w:t>UI-24. 20 Final Preview Playing.</w:t>
-      </w:r>
-    </w:p>
-    <w:p>
-      <w:r>
-        <w:br w:type="page"/>
+        <w:t>UI-21. 20 Final Preview Playing.</w:t>
       </w:r>
     </w:p>
     <w:p>
@@ -4939,7 +4755,7 @@
         <w:drawing>
           <wp:inline xmlns:a="http://schemas.openxmlformats.org/drawingml/2006/main" xmlns:pic="http://schemas.openxmlformats.org/drawingml/2006/picture">
             <wp:extent cx="5303520" cy="2983230"/>
-            <wp:docPr id="38" name="Picture 38"/>
+            <wp:docPr id="35" name="Picture 35"/>
             <wp:cNvGraphicFramePr>
               <a:graphicFrameLocks noChangeAspect="1"/>
             </wp:cNvGraphicFramePr>
@@ -4951,7 +4767,7 @@
                     <pic:cNvPicPr/>
                   </pic:nvPicPr>
                   <pic:blipFill>
-                    <a:blip r:embed="rId43"/>
+                    <a:blip r:embed="rId40"/>
                     <a:stretch>
                       <a:fillRect/>
                     </a:stretch>
@@ -4984,7 +4800,7 @@
           <w:color w:val="5B6570"/>
           <w:sz w:val="18"/>
         </w:rPr>
-        <w:t>UI-25. 21 Record Voice.</w:t>
+        <w:t>UI-22. 21 Record Voice.</w:t>
       </w:r>
     </w:p>
     <w:p>

</xml_diff>